<commit_message>
Prepare project for GitHub upload
</commit_message>
<xml_diff>
--- a/baocao/BÁO CÁO KHÓA LUẬN - Nguyễn Thành Nguyên - 225255.docx
+++ b/baocao/BÁO CÁO KHÓA LUẬN - Nguyễn Thành Nguyên - 225255.docx
@@ -4181,7 +4181,19 @@
         <w:rPr>
           <w:rFonts w:cs="Times New Roman"/>
         </w:rPr>
-        <w:t>Bệnh võng mạc đái tháo đường là một biến chứng nguy hiểm của bệnh đái tháo đường, có thể gây suy giảm thị lực nếu không được phát hiện và theo dõi kịp thời. Đề tài này tập trung xây dựng mô hình học sâu hỗ trợ phân loại bệnh võng mạc đái tháo đường từ ảnh đáy mắt theo 5 mức độ: No DR, Mild DR, Moderate DR, Severe DR và Proliferative DR. Tập dữ liệu được sử dụng là APTOS 2019 Blindness Detection. Ảnh đầu vào được tiền xử lý bằng các bước cắt vùng viền đen, tăng cường tương phản bằng CLAHE, thay đổi kích thước về 320×320 và chuẩn hóa trước khi đưa vào mô hình. Hai mô hình DenseNet121 và EfficientNetB3 được xây dựng, huấn luyện riêng, sau đó kết hợp xác suất đầu ra bằng phương pháp ensemble weighted average với trọng số 0,45 cho DenseNet121 và 0,55 cho EfficientNetB3.</w:t>
+        <w:t>Bệnh đái tháo đường</w:t>
+      </w:r>
+      <w:r>
+        <w:rPr>
+          <w:rFonts w:cs="Times New Roman"/>
+        </w:rPr>
+        <w:t xml:space="preserve"> là một trong những bệnh nguy hiểm cho sức khỏe</w:t>
+      </w:r>
+      <w:r>
+        <w:rPr>
+          <w:rFonts w:cs="Times New Roman"/>
+        </w:rPr>
+        <w:t>, có thể gây suy giảm thị lực nếu không được phát hiện và theo dõi kịp thời. Đề tài này tập trung xây dựng mô hình học sâu hỗ trợ phân loại bệnh võng mạc đái tháo đường từ ảnh đáy mắt theo 5 mức độ: No DR, Mild DR, Moderate DR, Severe DR và Proliferative DR. Tập dữ liệu được sử dụng là APTOS 2019 Blindness Detection. Ảnh đầu vào được tiền xử lý bằng các bước cắt vùng viền đen, tăng cường tương phản bằng CLAHE, thay đổi kích thước về 320×320 và chuẩn hóa trước khi đưa vào mô hình. Hai mô hình DenseNet121 và EfficientNetB3 được xây dựng, huấn luyện riêng, sau đó kết hợp xác suất đầu ra bằng phương pháp ensemble weighted average với trọng số 0,45 cho DenseNet121 và 0,55 cho EfficientNetB3.</w:t>
       </w:r>
     </w:p>
     <w:p>
@@ -15527,9 +15539,6 @@
       </w:r>
     </w:p>
     <w:p>
-      <w:pPr>
-        <w:ind w:firstLine="567"/>
-      </w:pPr>
       <w:r>
         <w:rPr>
           <w:rFonts w:eastAsia="Times New Roman" w:cs="Times New Roman"/>

</xml_diff>